<commit_message>
CBNS : LAB 19 down done !!!
</commit_message>
<xml_diff>
--- a/Y3/T2/Network Security/Lab/MOD12-13-14/GNS3/Answer/15.0.3 Lab - Creating Codes.docx
+++ b/Y3/T2/Network Security/Lab/MOD12-13-14/GNS3/Answer/15.0.3 Lab - Creating Codes.docx
@@ -1,6 +1,6 @@
 
 <file path=word/document.xml><?xml version="1.0" encoding="utf-8"?>
-<w:document xmlns:wpc="http://schemas.microsoft.com/office/word/2010/wordprocessingCanvas" xmlns:cx="http://schemas.microsoft.com/office/drawing/2014/chartex" xmlns:cx1="http://schemas.microsoft.com/office/drawing/2015/9/8/chartex" xmlns:cx2="http://schemas.microsoft.com/office/drawing/2015/10/21/chartex" xmlns:cx3="http://schemas.microsoft.com/office/drawing/2016/5/9/chartex" xmlns:cx4="http://schemas.microsoft.com/office/drawing/2016/5/10/chartex" xmlns:cx5="http://schemas.microsoft.com/office/drawing/2016/5/11/chartex" xmlns:cx6="http://schemas.microsoft.com/office/drawing/2016/5/12/chartex" xmlns:cx7="http://schemas.microsoft.com/office/drawing/2016/5/13/chartex" xmlns:cx8="http://schemas.microsoft.com/office/drawing/2016/5/14/chartex" xmlns:mc="http://schemas.openxmlformats.org/markup-compatibility/2006" xmlns:aink="http://schemas.microsoft.com/office/drawing/2016/ink" xmlns:am3d="http://schemas.microsoft.com/office/drawing/2017/model3d" xmlns:o="urn:schemas-microsoft-com:office:office" xmlns:r="http://schemas.openxmlformats.org/officeDocument/2006/relationships" xmlns:m="http://schemas.openxmlformats.org/officeDocument/2006/math" xmlns:v="urn:schemas-microsoft-com:vml" xmlns:wp14="http://schemas.microsoft.com/office/word/2010/wordprocessingDrawing" xmlns:wp="http://schemas.openxmlformats.org/drawingml/2006/wordprocessingDrawing" xmlns:w10="urn:schemas-microsoft-com:office:word" xmlns:w="http://schemas.openxmlformats.org/wordprocessingml/2006/main" xmlns:w14="http://schemas.microsoft.com/office/word/2010/wordml" xmlns:w15="http://schemas.microsoft.com/office/word/2012/wordml" xmlns:w16cex="http://schemas.microsoft.com/office/word/2018/wordml/cex" xmlns:w16cid="http://schemas.microsoft.com/office/word/2016/wordml/cid" xmlns:w16="http://schemas.microsoft.com/office/word/2018/wordml" xmlns:w16se="http://schemas.microsoft.com/office/word/2015/wordml/symex" xmlns:wpg="http://schemas.microsoft.com/office/word/2010/wordprocessingGroup" xmlns:wpi="http://schemas.microsoft.com/office/word/2010/wordprocessingInk" xmlns:wne="http://schemas.microsoft.com/office/word/2006/wordml" xmlns:wps="http://schemas.microsoft.com/office/word/2010/wordprocessingShape" mc:Ignorable="w14 w15 w16se w16cid w16 w16cex wp14">
+<w:document xmlns:wpc="http://schemas.microsoft.com/office/word/2010/wordprocessingCanvas" xmlns:cx="http://schemas.microsoft.com/office/drawing/2014/chartex" xmlns:cx1="http://schemas.microsoft.com/office/drawing/2015/9/8/chartex" xmlns:cx2="http://schemas.microsoft.com/office/drawing/2015/10/21/chartex" xmlns:cx3="http://schemas.microsoft.com/office/drawing/2016/5/9/chartex" xmlns:cx4="http://schemas.microsoft.com/office/drawing/2016/5/10/chartex" xmlns:cx5="http://schemas.microsoft.com/office/drawing/2016/5/11/chartex" xmlns:cx6="http://schemas.microsoft.com/office/drawing/2016/5/12/chartex" xmlns:cx7="http://schemas.microsoft.com/office/drawing/2016/5/13/chartex" xmlns:cx8="http://schemas.microsoft.com/office/drawing/2016/5/14/chartex" xmlns:mc="http://schemas.openxmlformats.org/markup-compatibility/2006" xmlns:aink="http://schemas.microsoft.com/office/drawing/2016/ink" xmlns:am3d="http://schemas.microsoft.com/office/drawing/2017/model3d" xmlns:o="urn:schemas-microsoft-com:office:office" xmlns:oel="http://schemas.microsoft.com/office/2019/extlst" xmlns:r="http://schemas.openxmlformats.org/officeDocument/2006/relationships" xmlns:m="http://schemas.openxmlformats.org/officeDocument/2006/math" xmlns:v="urn:schemas-microsoft-com:vml" xmlns:wp14="http://schemas.microsoft.com/office/word/2010/wordprocessingDrawing" xmlns:wp="http://schemas.openxmlformats.org/drawingml/2006/wordprocessingDrawing" xmlns:w10="urn:schemas-microsoft-com:office:word" xmlns:w="http://schemas.openxmlformats.org/wordprocessingml/2006/main" xmlns:w14="http://schemas.microsoft.com/office/word/2010/wordml" xmlns:w15="http://schemas.microsoft.com/office/word/2012/wordml" xmlns:w16cex="http://schemas.microsoft.com/office/word/2018/wordml/cex" xmlns:w16cid="http://schemas.microsoft.com/office/word/2016/wordml/cid" xmlns:w16="http://schemas.microsoft.com/office/word/2018/wordml" xmlns:w16du="http://schemas.microsoft.com/office/word/2023/wordml/word16du" xmlns:w16sdtdh="http://schemas.microsoft.com/office/word/2020/wordml/sdtdatahash" xmlns:w16sdtfl="http://schemas.microsoft.com/office/word/2024/wordml/sdtformatlock" xmlns:w16se="http://schemas.microsoft.com/office/word/2015/wordml/symex" xmlns:wpg="http://schemas.microsoft.com/office/word/2010/wordprocessingGroup" xmlns:wpi="http://schemas.microsoft.com/office/word/2010/wordprocessingInk" xmlns:wne="http://schemas.microsoft.com/office/word/2006/wordml" xmlns:wps="http://schemas.microsoft.com/office/word/2010/wordprocessingShape" mc:Ignorable="w14 w15 w16se w16cid w16 w16cex w16sdtdh w16sdtfl w16du wp14">
   <w:body>
     <w:p>
       <w:pPr>
@@ -13,6 +13,10 @@
       </w:pPr>
       <w:sdt>
         <w:sdtPr>
+          <w:rPr>
+            <w:b w:val="0"/>
+            <w:color w:val="EE0000"/>
+          </w:rPr>
           <w:alias w:val="Title"/>
           <w:tag w:val=""/>
           <w:id w:val="-487021785"/>
@@ -22,6 +26,12 @@
           <w:dataBinding w:prefixMappings="xmlns:ns0='http://purl.org/dc/elements/1.1/' xmlns:ns1='http://schemas.openxmlformats.org/package/2006/metadata/core-properties' " w:xpath="/ns1:coreProperties[1]/ns0:title[1]" w:storeItemID="{6C3C8BC8-F283-45AE-878A-BAB7291924A1}"/>
           <w:text/>
         </w:sdtPr>
+        <w:sdtEndPr>
+          <w:rPr>
+            <w:b/>
+            <w:color w:val="auto"/>
+          </w:rPr>
+        </w:sdtEndPr>
         <w:sdtContent>
           <w:r>
             <w:t>Lab</w:t>
@@ -32,6 +42,9 @@
           <w:r>
             <w:t>- Creating Codes</w:t>
           </w:r>
+          <w:r>
+            <w:t xml:space="preserve"> ( THY DAYUTH )</w:t>
+          </w:r>
         </w:sdtContent>
       </w:sdt>
     </w:p>
@@ -291,17 +304,35 @@
       <w:r>
         <w:t xml:space="preserve">Enter a </w:t>
       </w:r>
+      <w:proofErr w:type="gramStart"/>
       <w:r>
         <w:t>plain</w:t>
       </w:r>
       <w:r>
-        <w:t xml:space="preserve">text message of your choice in the text box. The message can be very short or it can be lengthy. Be sure that your lab partner does not see the </w:t>
-      </w:r>
+        <w:t>text</w:t>
+      </w:r>
+      <w:proofErr w:type="gramEnd"/>
+      <w:r>
+        <w:t xml:space="preserve"> message of your choice in the text box. The message can be very </w:t>
+      </w:r>
+      <w:proofErr w:type="gramStart"/>
+      <w:r>
+        <w:t>short</w:t>
+      </w:r>
+      <w:proofErr w:type="gramEnd"/>
+      <w:r>
+        <w:t xml:space="preserve"> or it can be lengthy. Be sure that your lab partner does not see the </w:t>
+      </w:r>
+      <w:proofErr w:type="gramStart"/>
       <w:r>
         <w:t>plain</w:t>
       </w:r>
       <w:r>
-        <w:t>text message.</w:t>
+        <w:t>text</w:t>
+      </w:r>
+      <w:proofErr w:type="gramEnd"/>
+      <w:r>
+        <w:t xml:space="preserve"> message.</w:t>
       </w:r>
     </w:p>
     <w:p>
@@ -318,6 +349,7 @@
         <w:keepNext/>
       </w:pPr>
       <w:r>
+        <w:lastRenderedPageBreak/>
         <w:t xml:space="preserve">Enter a secret key. Some tools may ask you to confirm the password. In our example, we used </w:t>
       </w:r>
       <w:r>
@@ -465,10 +497,18 @@
         <w:pStyle w:val="SubStepAlpha"/>
       </w:pPr>
       <w:r>
-        <w:t>Copy or Dow</w:t>
-      </w:r>
-      <w:r>
-        <w:t>nload the resulting message.</w:t>
+        <w:t xml:space="preserve">Copy or </w:t>
+      </w:r>
+      <w:proofErr w:type="gramStart"/>
+      <w:r>
+        <w:t>Dow</w:t>
+      </w:r>
+      <w:r>
+        <w:t>nload</w:t>
+      </w:r>
+      <w:proofErr w:type="gramEnd"/>
+      <w:r>
+        <w:t xml:space="preserve"> the resulting message.</w:t>
       </w:r>
     </w:p>
     <w:p>
@@ -563,21 +603,42 @@
         <w:spacing w:before="0"/>
       </w:pPr>
       <w:r>
-        <w:t>What happens if you use a wrong secret key?</w:t>
+        <w:t xml:space="preserve">What happens if you use </w:t>
+      </w:r>
+      <w:proofErr w:type="gramStart"/>
+      <w:r>
+        <w:t>a wrong</w:t>
+      </w:r>
+      <w:proofErr w:type="gramEnd"/>
+      <w:r>
+        <w:t xml:space="preserve"> secret key?</w:t>
       </w:r>
     </w:p>
     <w:p>
       <w:pPr>
-        <w:pStyle w:val="AnswerLineL50"/>
-      </w:pPr>
-      <w:r>
-        <w:t>Type your answers here.</w:t>
-      </w:r>
-    </w:p>
-    <w:p>
-      <w:pPr>
         <w:pStyle w:val="ConfigWindow"/>
-      </w:pPr>
+        <w:ind w:firstLine="720"/>
+      </w:pPr>
+      <w:r>
+        <w:rPr>
+          <w:rFonts w:eastAsia="Calibri"/>
+          <w:b/>
+          <w:color w:val="EE0000"/>
+          <w:sz w:val="20"/>
+          <w:szCs w:val="22"/>
+        </w:rPr>
+        <w:t>The ciphertext resulted in an unsuccessful decryption</w:t>
+      </w:r>
+      <w:r>
+        <w:rPr>
+          <w:rFonts w:eastAsia="Calibri"/>
+          <w:b/>
+          <w:color w:val="EE0000"/>
+          <w:sz w:val="20"/>
+          <w:szCs w:val="22"/>
+        </w:rPr>
+        <w:t xml:space="preserve"> </w:t>
+      </w:r>
       <w:r>
         <w:t>End of document</w:t>
       </w:r>
@@ -598,7 +659,7 @@
 </file>
 
 <file path=word/endnotes.xml><?xml version="1.0" encoding="utf-8"?>
-<w:endnotes xmlns:wpc="http://schemas.microsoft.com/office/word/2010/wordprocessingCanvas" xmlns:cx="http://schemas.microsoft.com/office/drawing/2014/chartex" xmlns:cx1="http://schemas.microsoft.com/office/drawing/2015/9/8/chartex" xmlns:cx2="http://schemas.microsoft.com/office/drawing/2015/10/21/chartex" xmlns:cx3="http://schemas.microsoft.com/office/drawing/2016/5/9/chartex" xmlns:cx4="http://schemas.microsoft.com/office/drawing/2016/5/10/chartex" xmlns:cx5="http://schemas.microsoft.com/office/drawing/2016/5/11/chartex" xmlns:cx6="http://schemas.microsoft.com/office/drawing/2016/5/12/chartex" xmlns:cx7="http://schemas.microsoft.com/office/drawing/2016/5/13/chartex" xmlns:cx8="http://schemas.microsoft.com/office/drawing/2016/5/14/chartex" xmlns:mc="http://schemas.openxmlformats.org/markup-compatibility/2006" xmlns:aink="http://schemas.microsoft.com/office/drawing/2016/ink" xmlns:am3d="http://schemas.microsoft.com/office/drawing/2017/model3d" xmlns:o="urn:schemas-microsoft-com:office:office" xmlns:r="http://schemas.openxmlformats.org/officeDocument/2006/relationships" xmlns:m="http://schemas.openxmlformats.org/officeDocument/2006/math" xmlns:v="urn:schemas-microsoft-com:vml" xmlns:wp14="http://schemas.microsoft.com/office/word/2010/wordprocessingDrawing" xmlns:wp="http://schemas.openxmlformats.org/drawingml/2006/wordprocessingDrawing" xmlns:w10="urn:schemas-microsoft-com:office:word" xmlns:w="http://schemas.openxmlformats.org/wordprocessingml/2006/main" xmlns:w14="http://schemas.microsoft.com/office/word/2010/wordml" xmlns:w15="http://schemas.microsoft.com/office/word/2012/wordml" xmlns:w16cex="http://schemas.microsoft.com/office/word/2018/wordml/cex" xmlns:w16cid="http://schemas.microsoft.com/office/word/2016/wordml/cid" xmlns:w16="http://schemas.microsoft.com/office/word/2018/wordml" xmlns:w16se="http://schemas.microsoft.com/office/word/2015/wordml/symex" xmlns:wpg="http://schemas.microsoft.com/office/word/2010/wordprocessingGroup" xmlns:wpi="http://schemas.microsoft.com/office/word/2010/wordprocessingInk" xmlns:wne="http://schemas.microsoft.com/office/word/2006/wordml" xmlns:wps="http://schemas.microsoft.com/office/word/2010/wordprocessingShape" mc:Ignorable="w14 w15 w16se w16cid w16 w16cex wp14">
+<w:endnotes xmlns:wpc="http://schemas.microsoft.com/office/word/2010/wordprocessingCanvas" xmlns:cx="http://schemas.microsoft.com/office/drawing/2014/chartex" xmlns:cx1="http://schemas.microsoft.com/office/drawing/2015/9/8/chartex" xmlns:cx2="http://schemas.microsoft.com/office/drawing/2015/10/21/chartex" xmlns:cx3="http://schemas.microsoft.com/office/drawing/2016/5/9/chartex" xmlns:cx4="http://schemas.microsoft.com/office/drawing/2016/5/10/chartex" xmlns:cx5="http://schemas.microsoft.com/office/drawing/2016/5/11/chartex" xmlns:cx6="http://schemas.microsoft.com/office/drawing/2016/5/12/chartex" xmlns:cx7="http://schemas.microsoft.com/office/drawing/2016/5/13/chartex" xmlns:cx8="http://schemas.microsoft.com/office/drawing/2016/5/14/chartex" xmlns:mc="http://schemas.openxmlformats.org/markup-compatibility/2006" xmlns:aink="http://schemas.microsoft.com/office/drawing/2016/ink" xmlns:am3d="http://schemas.microsoft.com/office/drawing/2017/model3d" xmlns:o="urn:schemas-microsoft-com:office:office" xmlns:oel="http://schemas.microsoft.com/office/2019/extlst" xmlns:r="http://schemas.openxmlformats.org/officeDocument/2006/relationships" xmlns:m="http://schemas.openxmlformats.org/officeDocument/2006/math" xmlns:v="urn:schemas-microsoft-com:vml" xmlns:wp14="http://schemas.microsoft.com/office/word/2010/wordprocessingDrawing" xmlns:wp="http://schemas.openxmlformats.org/drawingml/2006/wordprocessingDrawing" xmlns:w10="urn:schemas-microsoft-com:office:word" xmlns:w="http://schemas.openxmlformats.org/wordprocessingml/2006/main" xmlns:w14="http://schemas.microsoft.com/office/word/2010/wordml" xmlns:w15="http://schemas.microsoft.com/office/word/2012/wordml" xmlns:w16cex="http://schemas.microsoft.com/office/word/2018/wordml/cex" xmlns:w16cid="http://schemas.microsoft.com/office/word/2016/wordml/cid" xmlns:w16="http://schemas.microsoft.com/office/word/2018/wordml" xmlns:w16du="http://schemas.microsoft.com/office/word/2023/wordml/word16du" xmlns:w16sdtdh="http://schemas.microsoft.com/office/word/2020/wordml/sdtdatahash" xmlns:w16sdtfl="http://schemas.microsoft.com/office/word/2024/wordml/sdtformatlock" xmlns:w16se="http://schemas.microsoft.com/office/word/2015/wordml/symex" xmlns:wpg="http://schemas.microsoft.com/office/word/2010/wordprocessingGroup" xmlns:wpi="http://schemas.microsoft.com/office/word/2010/wordprocessingInk" xmlns:wne="http://schemas.microsoft.com/office/word/2006/wordml" xmlns:wps="http://schemas.microsoft.com/office/word/2010/wordprocessingShape" mc:Ignorable="w14 w15 w16se w16cid w16 w16cex w16sdtdh w16sdtfl w16du wp14">
   <w:endnote w:type="separator" w:id="-1">
     <w:p>
       <w:pPr>
@@ -625,7 +686,7 @@
 </file>
 
 <file path=word/footer1.xml><?xml version="1.0" encoding="utf-8"?>
-<w:ftr xmlns:wpc="http://schemas.microsoft.com/office/word/2010/wordprocessingCanvas" xmlns:cx="http://schemas.microsoft.com/office/drawing/2014/chartex" xmlns:cx1="http://schemas.microsoft.com/office/drawing/2015/9/8/chartex" xmlns:cx2="http://schemas.microsoft.com/office/drawing/2015/10/21/chartex" xmlns:cx3="http://schemas.microsoft.com/office/drawing/2016/5/9/chartex" xmlns:cx4="http://schemas.microsoft.com/office/drawing/2016/5/10/chartex" xmlns:cx5="http://schemas.microsoft.com/office/drawing/2016/5/11/chartex" xmlns:cx6="http://schemas.microsoft.com/office/drawing/2016/5/12/chartex" xmlns:cx7="http://schemas.microsoft.com/office/drawing/2016/5/13/chartex" xmlns:cx8="http://schemas.microsoft.com/office/drawing/2016/5/14/chartex" xmlns:mc="http://schemas.openxmlformats.org/markup-compatibility/2006" xmlns:aink="http://schemas.microsoft.com/office/drawing/2016/ink" xmlns:am3d="http://schemas.microsoft.com/office/drawing/2017/model3d" xmlns:o="urn:schemas-microsoft-com:office:office" xmlns:r="http://schemas.openxmlformats.org/officeDocument/2006/relationships" xmlns:m="http://schemas.openxmlformats.org/officeDocument/2006/math" xmlns:v="urn:schemas-microsoft-com:vml" xmlns:wp14="http://schemas.microsoft.com/office/word/2010/wordprocessingDrawing" xmlns:wp="http://schemas.openxmlformats.org/drawingml/2006/wordprocessingDrawing" xmlns:w10="urn:schemas-microsoft-com:office:word" xmlns:w="http://schemas.openxmlformats.org/wordprocessingml/2006/main" xmlns:w14="http://schemas.microsoft.com/office/word/2010/wordml" xmlns:w15="http://schemas.microsoft.com/office/word/2012/wordml" xmlns:w16cex="http://schemas.microsoft.com/office/word/2018/wordml/cex" xmlns:w16cid="http://schemas.microsoft.com/office/word/2016/wordml/cid" xmlns:w16="http://schemas.microsoft.com/office/word/2018/wordml" xmlns:w16se="http://schemas.microsoft.com/office/word/2015/wordml/symex" xmlns:wpg="http://schemas.microsoft.com/office/word/2010/wordprocessingGroup" xmlns:wpi="http://schemas.microsoft.com/office/word/2010/wordprocessingInk" xmlns:wne="http://schemas.microsoft.com/office/word/2006/wordml" xmlns:wps="http://schemas.microsoft.com/office/word/2010/wordprocessingShape" mc:Ignorable="w14 w15 w16se w16cid w16 w16cex wp14">
+<w:ftr xmlns:wpc="http://schemas.microsoft.com/office/word/2010/wordprocessingCanvas" xmlns:cx="http://schemas.microsoft.com/office/drawing/2014/chartex" xmlns:cx1="http://schemas.microsoft.com/office/drawing/2015/9/8/chartex" xmlns:cx2="http://schemas.microsoft.com/office/drawing/2015/10/21/chartex" xmlns:cx3="http://schemas.microsoft.com/office/drawing/2016/5/9/chartex" xmlns:cx4="http://schemas.microsoft.com/office/drawing/2016/5/10/chartex" xmlns:cx5="http://schemas.microsoft.com/office/drawing/2016/5/11/chartex" xmlns:cx6="http://schemas.microsoft.com/office/drawing/2016/5/12/chartex" xmlns:cx7="http://schemas.microsoft.com/office/drawing/2016/5/13/chartex" xmlns:cx8="http://schemas.microsoft.com/office/drawing/2016/5/14/chartex" xmlns:mc="http://schemas.openxmlformats.org/markup-compatibility/2006" xmlns:aink="http://schemas.microsoft.com/office/drawing/2016/ink" xmlns:am3d="http://schemas.microsoft.com/office/drawing/2017/model3d" xmlns:o="urn:schemas-microsoft-com:office:office" xmlns:oel="http://schemas.microsoft.com/office/2019/extlst" xmlns:r="http://schemas.openxmlformats.org/officeDocument/2006/relationships" xmlns:m="http://schemas.openxmlformats.org/officeDocument/2006/math" xmlns:v="urn:schemas-microsoft-com:vml" xmlns:wp14="http://schemas.microsoft.com/office/word/2010/wordprocessingDrawing" xmlns:wp="http://schemas.openxmlformats.org/drawingml/2006/wordprocessingDrawing" xmlns:w10="urn:schemas-microsoft-com:office:word" xmlns:w="http://schemas.openxmlformats.org/wordprocessingml/2006/main" xmlns:w14="http://schemas.microsoft.com/office/word/2010/wordml" xmlns:w15="http://schemas.microsoft.com/office/word/2012/wordml" xmlns:w16cex="http://schemas.microsoft.com/office/word/2018/wordml/cex" xmlns:w16cid="http://schemas.microsoft.com/office/word/2016/wordml/cid" xmlns:w16="http://schemas.microsoft.com/office/word/2018/wordml" xmlns:w16du="http://schemas.microsoft.com/office/word/2023/wordml/word16du" xmlns:w16sdtdh="http://schemas.microsoft.com/office/word/2020/wordml/sdtdatahash" xmlns:w16sdtfl="http://schemas.microsoft.com/office/word/2024/wordml/sdtformatlock" xmlns:w16se="http://schemas.microsoft.com/office/word/2015/wordml/symex" xmlns:wpg="http://schemas.microsoft.com/office/word/2010/wordprocessingGroup" xmlns:wpi="http://schemas.microsoft.com/office/word/2010/wordprocessingInk" xmlns:wne="http://schemas.microsoft.com/office/word/2006/wordml" xmlns:wps="http://schemas.microsoft.com/office/word/2010/wordprocessingShape" mc:Ignorable="w14 w15 w16se w16cid w16 w16cex w16sdtdh w16sdtfl w16du wp14">
   <w:p>
     <w:pPr>
       <w:pStyle w:val="Footer"/>
@@ -647,7 +708,6 @@
         <w:dataBinding w:prefixMappings="xmlns:ns0='http://purl.org/dc/elements/1.1/' xmlns:ns1='http://schemas.openxmlformats.org/package/2006/metadata/core-properties' " w:xpath="/ns1:coreProperties[1]/ns0:description[1]" w:storeItemID="{6C3C8BC8-F283-45AE-878A-BAB7291924A1}"/>
         <w:text w:multiLine="1"/>
       </w:sdtPr>
-      <w:sdtEndPr/>
       <w:sdtContent>
         <w:r>
           <w:t>2017</w:t>
@@ -785,7 +845,7 @@
 </file>
 
 <file path=word/footer2.xml><?xml version="1.0" encoding="utf-8"?>
-<w:ftr xmlns:wpc="http://schemas.microsoft.com/office/word/2010/wordprocessingCanvas" xmlns:cx="http://schemas.microsoft.com/office/drawing/2014/chartex" xmlns:cx1="http://schemas.microsoft.com/office/drawing/2015/9/8/chartex" xmlns:cx2="http://schemas.microsoft.com/office/drawing/2015/10/21/chartex" xmlns:cx3="http://schemas.microsoft.com/office/drawing/2016/5/9/chartex" xmlns:cx4="http://schemas.microsoft.com/office/drawing/2016/5/10/chartex" xmlns:cx5="http://schemas.microsoft.com/office/drawing/2016/5/11/chartex" xmlns:cx6="http://schemas.microsoft.com/office/drawing/2016/5/12/chartex" xmlns:cx7="http://schemas.microsoft.com/office/drawing/2016/5/13/chartex" xmlns:cx8="http://schemas.microsoft.com/office/drawing/2016/5/14/chartex" xmlns:mc="http://schemas.openxmlformats.org/markup-compatibility/2006" xmlns:aink="http://schemas.microsoft.com/office/drawing/2016/ink" xmlns:am3d="http://schemas.microsoft.com/office/drawing/2017/model3d" xmlns:o="urn:schemas-microsoft-com:office:office" xmlns:r="http://schemas.openxmlformats.org/officeDocument/2006/relationships" xmlns:m="http://schemas.openxmlformats.org/officeDocument/2006/math" xmlns:v="urn:schemas-microsoft-com:vml" xmlns:wp14="http://schemas.microsoft.com/office/word/2010/wordprocessingDrawing" xmlns:wp="http://schemas.openxmlformats.org/drawingml/2006/wordprocessingDrawing" xmlns:w10="urn:schemas-microsoft-com:office:word" xmlns:w="http://schemas.openxmlformats.org/wordprocessingml/2006/main" xmlns:w14="http://schemas.microsoft.com/office/word/2010/wordml" xmlns:w15="http://schemas.microsoft.com/office/word/2012/wordml" xmlns:w16cex="http://schemas.microsoft.com/office/word/2018/wordml/cex" xmlns:w16cid="http://schemas.microsoft.com/office/word/2016/wordml/cid" xmlns:w16="http://schemas.microsoft.com/office/word/2018/wordml" xmlns:w16se="http://schemas.microsoft.com/office/word/2015/wordml/symex" xmlns:wpg="http://schemas.microsoft.com/office/word/2010/wordprocessingGroup" xmlns:wpi="http://schemas.microsoft.com/office/word/2010/wordprocessingInk" xmlns:wne="http://schemas.microsoft.com/office/word/2006/wordml" xmlns:wps="http://schemas.microsoft.com/office/word/2010/wordprocessingShape" mc:Ignorable="w14 w15 w16se w16cid w16 w16cex wp14">
+<w:ftr xmlns:wpc="http://schemas.microsoft.com/office/word/2010/wordprocessingCanvas" xmlns:cx="http://schemas.microsoft.com/office/drawing/2014/chartex" xmlns:cx1="http://schemas.microsoft.com/office/drawing/2015/9/8/chartex" xmlns:cx2="http://schemas.microsoft.com/office/drawing/2015/10/21/chartex" xmlns:cx3="http://schemas.microsoft.com/office/drawing/2016/5/9/chartex" xmlns:cx4="http://schemas.microsoft.com/office/drawing/2016/5/10/chartex" xmlns:cx5="http://schemas.microsoft.com/office/drawing/2016/5/11/chartex" xmlns:cx6="http://schemas.microsoft.com/office/drawing/2016/5/12/chartex" xmlns:cx7="http://schemas.microsoft.com/office/drawing/2016/5/13/chartex" xmlns:cx8="http://schemas.microsoft.com/office/drawing/2016/5/14/chartex" xmlns:mc="http://schemas.openxmlformats.org/markup-compatibility/2006" xmlns:aink="http://schemas.microsoft.com/office/drawing/2016/ink" xmlns:am3d="http://schemas.microsoft.com/office/drawing/2017/model3d" xmlns:o="urn:schemas-microsoft-com:office:office" xmlns:oel="http://schemas.microsoft.com/office/2019/extlst" xmlns:r="http://schemas.openxmlformats.org/officeDocument/2006/relationships" xmlns:m="http://schemas.openxmlformats.org/officeDocument/2006/math" xmlns:v="urn:schemas-microsoft-com:vml" xmlns:wp14="http://schemas.microsoft.com/office/word/2010/wordprocessingDrawing" xmlns:wp="http://schemas.openxmlformats.org/drawingml/2006/wordprocessingDrawing" xmlns:w10="urn:schemas-microsoft-com:office:word" xmlns:w="http://schemas.openxmlformats.org/wordprocessingml/2006/main" xmlns:w14="http://schemas.microsoft.com/office/word/2010/wordml" xmlns:w15="http://schemas.microsoft.com/office/word/2012/wordml" xmlns:w16cex="http://schemas.microsoft.com/office/word/2018/wordml/cex" xmlns:w16cid="http://schemas.microsoft.com/office/word/2016/wordml/cid" xmlns:w16="http://schemas.microsoft.com/office/word/2018/wordml" xmlns:w16du="http://schemas.microsoft.com/office/word/2023/wordml/word16du" xmlns:w16sdtdh="http://schemas.microsoft.com/office/word/2020/wordml/sdtdatahash" xmlns:w16sdtfl="http://schemas.microsoft.com/office/word/2024/wordml/sdtformatlock" xmlns:w16se="http://schemas.microsoft.com/office/word/2015/wordml/symex" xmlns:wpg="http://schemas.microsoft.com/office/word/2010/wordprocessingGroup" xmlns:wpi="http://schemas.microsoft.com/office/word/2010/wordprocessingInk" xmlns:wne="http://schemas.microsoft.com/office/word/2006/wordml" xmlns:wps="http://schemas.microsoft.com/office/word/2010/wordprocessingShape" mc:Ignorable="w14 w15 w16se w16cid w16 w16cex w16sdtdh w16sdtfl w16du wp14">
   <w:p>
     <w:pPr>
       <w:pStyle w:val="Footer"/>
@@ -807,7 +867,6 @@
         <w:dataBinding w:prefixMappings="xmlns:ns0='http://purl.org/dc/elements/1.1/' xmlns:ns1='http://schemas.openxmlformats.org/package/2006/metadata/core-properties' " w:xpath="/ns1:coreProperties[1]/ns0:description[1]" w:storeItemID="{6C3C8BC8-F283-45AE-878A-BAB7291924A1}"/>
         <w:text w:multiLine="1"/>
       </w:sdtPr>
-      <w:sdtEndPr/>
       <w:sdtContent>
         <w:r>
           <w:t>2017</w:t>
@@ -948,7 +1007,7 @@
 </file>
 
 <file path=word/footnotes.xml><?xml version="1.0" encoding="utf-8"?>
-<w:footnotes xmlns:wpc="http://schemas.microsoft.com/office/word/2010/wordprocessingCanvas" xmlns:cx="http://schemas.microsoft.com/office/drawing/2014/chartex" xmlns:cx1="http://schemas.microsoft.com/office/drawing/2015/9/8/chartex" xmlns:cx2="http://schemas.microsoft.com/office/drawing/2015/10/21/chartex" xmlns:cx3="http://schemas.microsoft.com/office/drawing/2016/5/9/chartex" xmlns:cx4="http://schemas.microsoft.com/office/drawing/2016/5/10/chartex" xmlns:cx5="http://schemas.microsoft.com/office/drawing/2016/5/11/chartex" xmlns:cx6="http://schemas.microsoft.com/office/drawing/2016/5/12/chartex" xmlns:cx7="http://schemas.microsoft.com/office/drawing/2016/5/13/chartex" xmlns:cx8="http://schemas.microsoft.com/office/drawing/2016/5/14/chartex" xmlns:mc="http://schemas.openxmlformats.org/markup-compatibility/2006" xmlns:aink="http://schemas.microsoft.com/office/drawing/2016/ink" xmlns:am3d="http://schemas.microsoft.com/office/drawing/2017/model3d" xmlns:o="urn:schemas-microsoft-com:office:office" xmlns:r="http://schemas.openxmlformats.org/officeDocument/2006/relationships" xmlns:m="http://schemas.openxmlformats.org/officeDocument/2006/math" xmlns:v="urn:schemas-microsoft-com:vml" xmlns:wp14="http://schemas.microsoft.com/office/word/2010/wordprocessingDrawing" xmlns:wp="http://schemas.openxmlformats.org/drawingml/2006/wordprocessingDrawing" xmlns:w10="urn:schemas-microsoft-com:office:word" xmlns:w="http://schemas.openxmlformats.org/wordprocessingml/2006/main" xmlns:w14="http://schemas.microsoft.com/office/word/2010/wordml" xmlns:w15="http://schemas.microsoft.com/office/word/2012/wordml" xmlns:w16cex="http://schemas.microsoft.com/office/word/2018/wordml/cex" xmlns:w16cid="http://schemas.microsoft.com/office/word/2016/wordml/cid" xmlns:w16="http://schemas.microsoft.com/office/word/2018/wordml" xmlns:w16se="http://schemas.microsoft.com/office/word/2015/wordml/symex" xmlns:wpg="http://schemas.microsoft.com/office/word/2010/wordprocessingGroup" xmlns:wpi="http://schemas.microsoft.com/office/word/2010/wordprocessingInk" xmlns:wne="http://schemas.microsoft.com/office/word/2006/wordml" xmlns:wps="http://schemas.microsoft.com/office/word/2010/wordprocessingShape" mc:Ignorable="w14 w15 w16se w16cid w16 w16cex wp14">
+<w:footnotes xmlns:wpc="http://schemas.microsoft.com/office/word/2010/wordprocessingCanvas" xmlns:cx="http://schemas.microsoft.com/office/drawing/2014/chartex" xmlns:cx1="http://schemas.microsoft.com/office/drawing/2015/9/8/chartex" xmlns:cx2="http://schemas.microsoft.com/office/drawing/2015/10/21/chartex" xmlns:cx3="http://schemas.microsoft.com/office/drawing/2016/5/9/chartex" xmlns:cx4="http://schemas.microsoft.com/office/drawing/2016/5/10/chartex" xmlns:cx5="http://schemas.microsoft.com/office/drawing/2016/5/11/chartex" xmlns:cx6="http://schemas.microsoft.com/office/drawing/2016/5/12/chartex" xmlns:cx7="http://schemas.microsoft.com/office/drawing/2016/5/13/chartex" xmlns:cx8="http://schemas.microsoft.com/office/drawing/2016/5/14/chartex" xmlns:mc="http://schemas.openxmlformats.org/markup-compatibility/2006" xmlns:aink="http://schemas.microsoft.com/office/drawing/2016/ink" xmlns:am3d="http://schemas.microsoft.com/office/drawing/2017/model3d" xmlns:o="urn:schemas-microsoft-com:office:office" xmlns:oel="http://schemas.microsoft.com/office/2019/extlst" xmlns:r="http://schemas.openxmlformats.org/officeDocument/2006/relationships" xmlns:m="http://schemas.openxmlformats.org/officeDocument/2006/math" xmlns:v="urn:schemas-microsoft-com:vml" xmlns:wp14="http://schemas.microsoft.com/office/word/2010/wordprocessingDrawing" xmlns:wp="http://schemas.openxmlformats.org/drawingml/2006/wordprocessingDrawing" xmlns:w10="urn:schemas-microsoft-com:office:word" xmlns:w="http://schemas.openxmlformats.org/wordprocessingml/2006/main" xmlns:w14="http://schemas.microsoft.com/office/word/2010/wordml" xmlns:w15="http://schemas.microsoft.com/office/word/2012/wordml" xmlns:w16cex="http://schemas.microsoft.com/office/word/2018/wordml/cex" xmlns:w16cid="http://schemas.microsoft.com/office/word/2016/wordml/cid" xmlns:w16="http://schemas.microsoft.com/office/word/2018/wordml" xmlns:w16du="http://schemas.microsoft.com/office/word/2023/wordml/word16du" xmlns:w16sdtdh="http://schemas.microsoft.com/office/word/2020/wordml/sdtdatahash" xmlns:w16sdtfl="http://schemas.microsoft.com/office/word/2024/wordml/sdtformatlock" xmlns:w16se="http://schemas.microsoft.com/office/word/2015/wordml/symex" xmlns:wpg="http://schemas.microsoft.com/office/word/2010/wordprocessingGroup" xmlns:wpi="http://schemas.microsoft.com/office/word/2010/wordprocessingInk" xmlns:wne="http://schemas.microsoft.com/office/word/2006/wordml" xmlns:wps="http://schemas.microsoft.com/office/word/2010/wordprocessingShape" mc:Ignorable="w14 w15 w16se w16cid w16 w16cex w16sdtdh w16sdtfl w16du wp14">
   <w:footnote w:type="separator" w:id="-1">
     <w:p>
       <w:pPr>
@@ -975,7 +1034,7 @@
 </file>
 
 <file path=word/header1.xml><?xml version="1.0" encoding="utf-8"?>
-<w:hdr xmlns:wpc="http://schemas.microsoft.com/office/word/2010/wordprocessingCanvas" xmlns:cx="http://schemas.microsoft.com/office/drawing/2014/chartex" xmlns:cx1="http://schemas.microsoft.com/office/drawing/2015/9/8/chartex" xmlns:cx2="http://schemas.microsoft.com/office/drawing/2015/10/21/chartex" xmlns:cx3="http://schemas.microsoft.com/office/drawing/2016/5/9/chartex" xmlns:cx4="http://schemas.microsoft.com/office/drawing/2016/5/10/chartex" xmlns:cx5="http://schemas.microsoft.com/office/drawing/2016/5/11/chartex" xmlns:cx6="http://schemas.microsoft.com/office/drawing/2016/5/12/chartex" xmlns:cx7="http://schemas.microsoft.com/office/drawing/2016/5/13/chartex" xmlns:cx8="http://schemas.microsoft.com/office/drawing/2016/5/14/chartex" xmlns:mc="http://schemas.openxmlformats.org/markup-compatibility/2006" xmlns:aink="http://schemas.microsoft.com/office/drawing/2016/ink" xmlns:am3d="http://schemas.microsoft.com/office/drawing/2017/model3d" xmlns:o="urn:schemas-microsoft-com:office:office" xmlns:r="http://schemas.openxmlformats.org/officeDocument/2006/relationships" xmlns:m="http://schemas.openxmlformats.org/officeDocument/2006/math" xmlns:v="urn:schemas-microsoft-com:vml" xmlns:wp14="http://schemas.microsoft.com/office/word/2010/wordprocessingDrawing" xmlns:wp="http://schemas.openxmlformats.org/drawingml/2006/wordprocessingDrawing" xmlns:w10="urn:schemas-microsoft-com:office:word" xmlns:w="http://schemas.openxmlformats.org/wordprocessingml/2006/main" xmlns:w14="http://schemas.microsoft.com/office/word/2010/wordml" xmlns:w15="http://schemas.microsoft.com/office/word/2012/wordml" xmlns:w16cex="http://schemas.microsoft.com/office/word/2018/wordml/cex" xmlns:w16cid="http://schemas.microsoft.com/office/word/2016/wordml/cid" xmlns:w16="http://schemas.microsoft.com/office/word/2018/wordml" xmlns:w16se="http://schemas.microsoft.com/office/word/2015/wordml/symex" xmlns:wpg="http://schemas.microsoft.com/office/word/2010/wordprocessingGroup" xmlns:wpi="http://schemas.microsoft.com/office/word/2010/wordprocessingInk" xmlns:wne="http://schemas.microsoft.com/office/word/2006/wordml" xmlns:wps="http://schemas.microsoft.com/office/word/2010/wordprocessingShape" mc:Ignorable="w14 w15 w16se w16cid w16 w16cex wp14">
+<w:hdr xmlns:wpc="http://schemas.microsoft.com/office/word/2010/wordprocessingCanvas" xmlns:cx="http://schemas.microsoft.com/office/drawing/2014/chartex" xmlns:cx1="http://schemas.microsoft.com/office/drawing/2015/9/8/chartex" xmlns:cx2="http://schemas.microsoft.com/office/drawing/2015/10/21/chartex" xmlns:cx3="http://schemas.microsoft.com/office/drawing/2016/5/9/chartex" xmlns:cx4="http://schemas.microsoft.com/office/drawing/2016/5/10/chartex" xmlns:cx5="http://schemas.microsoft.com/office/drawing/2016/5/11/chartex" xmlns:cx6="http://schemas.microsoft.com/office/drawing/2016/5/12/chartex" xmlns:cx7="http://schemas.microsoft.com/office/drawing/2016/5/13/chartex" xmlns:cx8="http://schemas.microsoft.com/office/drawing/2016/5/14/chartex" xmlns:mc="http://schemas.openxmlformats.org/markup-compatibility/2006" xmlns:aink="http://schemas.microsoft.com/office/drawing/2016/ink" xmlns:am3d="http://schemas.microsoft.com/office/drawing/2017/model3d" xmlns:o="urn:schemas-microsoft-com:office:office" xmlns:oel="http://schemas.microsoft.com/office/2019/extlst" xmlns:r="http://schemas.openxmlformats.org/officeDocument/2006/relationships" xmlns:m="http://schemas.openxmlformats.org/officeDocument/2006/math" xmlns:v="urn:schemas-microsoft-com:vml" xmlns:wp14="http://schemas.microsoft.com/office/word/2010/wordprocessingDrawing" xmlns:wp="http://schemas.openxmlformats.org/drawingml/2006/wordprocessingDrawing" xmlns:w10="urn:schemas-microsoft-com:office:word" xmlns:w="http://schemas.openxmlformats.org/wordprocessingml/2006/main" xmlns:w14="http://schemas.microsoft.com/office/word/2010/wordml" xmlns:w15="http://schemas.microsoft.com/office/word/2012/wordml" xmlns:w16cex="http://schemas.microsoft.com/office/word/2018/wordml/cex" xmlns:w16cid="http://schemas.microsoft.com/office/word/2016/wordml/cid" xmlns:w16="http://schemas.microsoft.com/office/word/2018/wordml" xmlns:w16du="http://schemas.microsoft.com/office/word/2023/wordml/word16du" xmlns:w16sdtdh="http://schemas.microsoft.com/office/word/2020/wordml/sdtdatahash" xmlns:w16sdtfl="http://schemas.microsoft.com/office/word/2024/wordml/sdtformatlock" xmlns:w16se="http://schemas.microsoft.com/office/word/2015/wordml/symex" xmlns:wpg="http://schemas.microsoft.com/office/word/2010/wordprocessingGroup" xmlns:wpi="http://schemas.microsoft.com/office/word/2010/wordprocessingInk" xmlns:wne="http://schemas.microsoft.com/office/word/2006/wordml" xmlns:wps="http://schemas.microsoft.com/office/word/2010/wordprocessingShape" mc:Ignorable="w14 w15 w16se w16cid w16 w16cex w16sdtdh w16sdtfl w16du wp14">
   <w:sdt>
     <w:sdtPr>
       <w:alias w:val="Title"/>
@@ -987,15 +1046,27 @@
       <w:dataBinding w:prefixMappings="xmlns:ns0='http://purl.org/dc/elements/1.1/' xmlns:ns1='http://schemas.openxmlformats.org/package/2006/metadata/core-properties' " w:xpath="/ns1:coreProperties[1]/ns0:title[1]" w:storeItemID="{6C3C8BC8-F283-45AE-878A-BAB7291924A1}"/>
       <w:text/>
     </w:sdtPr>
-    <w:sdtEndPr/>
     <w:sdtContent>
       <w:p>
         <w:pPr>
           <w:pStyle w:val="PageHead"/>
         </w:pPr>
         <w:r>
-          <w:t>Lab - Creating Codes</w:t>
+          <w:t xml:space="preserve">Lab - Creating Codes </w:t>
         </w:r>
+        <w:proofErr w:type="gramStart"/>
+        <w:r>
+          <w:t>( THY</w:t>
+        </w:r>
+        <w:proofErr w:type="gramEnd"/>
+        <w:r>
+          <w:t xml:space="preserve"> </w:t>
+        </w:r>
+        <w:proofErr w:type="gramStart"/>
+        <w:r>
+          <w:t>DAYUTH )</w:t>
+        </w:r>
+        <w:proofErr w:type="gramEnd"/>
       </w:p>
     </w:sdtContent>
   </w:sdt>
@@ -1003,7 +1074,7 @@
 </file>
 
 <file path=word/header2.xml><?xml version="1.0" encoding="utf-8"?>
-<w:hdr xmlns:wpc="http://schemas.microsoft.com/office/word/2010/wordprocessingCanvas" xmlns:cx="http://schemas.microsoft.com/office/drawing/2014/chartex" xmlns:cx1="http://schemas.microsoft.com/office/drawing/2015/9/8/chartex" xmlns:cx2="http://schemas.microsoft.com/office/drawing/2015/10/21/chartex" xmlns:cx3="http://schemas.microsoft.com/office/drawing/2016/5/9/chartex" xmlns:cx4="http://schemas.microsoft.com/office/drawing/2016/5/10/chartex" xmlns:cx5="http://schemas.microsoft.com/office/drawing/2016/5/11/chartex" xmlns:cx6="http://schemas.microsoft.com/office/drawing/2016/5/12/chartex" xmlns:cx7="http://schemas.microsoft.com/office/drawing/2016/5/13/chartex" xmlns:cx8="http://schemas.microsoft.com/office/drawing/2016/5/14/chartex" xmlns:mc="http://schemas.openxmlformats.org/markup-compatibility/2006" xmlns:aink="http://schemas.microsoft.com/office/drawing/2016/ink" xmlns:am3d="http://schemas.microsoft.com/office/drawing/2017/model3d" xmlns:o="urn:schemas-microsoft-com:office:office" xmlns:r="http://schemas.openxmlformats.org/officeDocument/2006/relationships" xmlns:m="http://schemas.openxmlformats.org/officeDocument/2006/math" xmlns:v="urn:schemas-microsoft-com:vml" xmlns:wp14="http://schemas.microsoft.com/office/word/2010/wordprocessingDrawing" xmlns:wp="http://schemas.openxmlformats.org/drawingml/2006/wordprocessingDrawing" xmlns:w10="urn:schemas-microsoft-com:office:word" xmlns:w="http://schemas.openxmlformats.org/wordprocessingml/2006/main" xmlns:w14="http://schemas.microsoft.com/office/word/2010/wordml" xmlns:w15="http://schemas.microsoft.com/office/word/2012/wordml" xmlns:w16cex="http://schemas.microsoft.com/office/word/2018/wordml/cex" xmlns:w16cid="http://schemas.microsoft.com/office/word/2016/wordml/cid" xmlns:w16="http://schemas.microsoft.com/office/word/2018/wordml" xmlns:w16se="http://schemas.microsoft.com/office/word/2015/wordml/symex" xmlns:wpg="http://schemas.microsoft.com/office/word/2010/wordprocessingGroup" xmlns:wpi="http://schemas.microsoft.com/office/word/2010/wordprocessingInk" xmlns:wne="http://schemas.microsoft.com/office/word/2006/wordml" xmlns:wps="http://schemas.microsoft.com/office/word/2010/wordprocessingShape" mc:Ignorable="w14 w15 w16se w16cid w16 w16cex wp14">
+<w:hdr xmlns:wpc="http://schemas.microsoft.com/office/word/2010/wordprocessingCanvas" xmlns:cx="http://schemas.microsoft.com/office/drawing/2014/chartex" xmlns:cx1="http://schemas.microsoft.com/office/drawing/2015/9/8/chartex" xmlns:cx2="http://schemas.microsoft.com/office/drawing/2015/10/21/chartex" xmlns:cx3="http://schemas.microsoft.com/office/drawing/2016/5/9/chartex" xmlns:cx4="http://schemas.microsoft.com/office/drawing/2016/5/10/chartex" xmlns:cx5="http://schemas.microsoft.com/office/drawing/2016/5/11/chartex" xmlns:cx6="http://schemas.microsoft.com/office/drawing/2016/5/12/chartex" xmlns:cx7="http://schemas.microsoft.com/office/drawing/2016/5/13/chartex" xmlns:cx8="http://schemas.microsoft.com/office/drawing/2016/5/14/chartex" xmlns:mc="http://schemas.openxmlformats.org/markup-compatibility/2006" xmlns:aink="http://schemas.microsoft.com/office/drawing/2016/ink" xmlns:am3d="http://schemas.microsoft.com/office/drawing/2017/model3d" xmlns:o="urn:schemas-microsoft-com:office:office" xmlns:oel="http://schemas.microsoft.com/office/2019/extlst" xmlns:r="http://schemas.openxmlformats.org/officeDocument/2006/relationships" xmlns:m="http://schemas.openxmlformats.org/officeDocument/2006/math" xmlns:v="urn:schemas-microsoft-com:vml" xmlns:wp14="http://schemas.microsoft.com/office/word/2010/wordprocessingDrawing" xmlns:wp="http://schemas.openxmlformats.org/drawingml/2006/wordprocessingDrawing" xmlns:w10="urn:schemas-microsoft-com:office:word" xmlns:w="http://schemas.openxmlformats.org/wordprocessingml/2006/main" xmlns:w14="http://schemas.microsoft.com/office/word/2010/wordml" xmlns:w15="http://schemas.microsoft.com/office/word/2012/wordml" xmlns:w16cex="http://schemas.microsoft.com/office/word/2018/wordml/cex" xmlns:w16cid="http://schemas.microsoft.com/office/word/2016/wordml/cid" xmlns:w16="http://schemas.microsoft.com/office/word/2018/wordml" xmlns:w16du="http://schemas.microsoft.com/office/word/2023/wordml/word16du" xmlns:w16sdtdh="http://schemas.microsoft.com/office/word/2020/wordml/sdtdatahash" xmlns:w16sdtfl="http://schemas.microsoft.com/office/word/2024/wordml/sdtformatlock" xmlns:w16se="http://schemas.microsoft.com/office/word/2015/wordml/symex" xmlns:wpg="http://schemas.microsoft.com/office/word/2010/wordprocessingGroup" xmlns:wpi="http://schemas.microsoft.com/office/word/2010/wordprocessingInk" xmlns:wne="http://schemas.microsoft.com/office/word/2006/wordml" xmlns:wps="http://schemas.microsoft.com/office/word/2010/wordprocessingShape" mc:Ignorable="w14 w15 w16se w16cid w16 w16cex w16sdtdh w16sdtfl w16du wp14">
   <w:p>
     <w:pPr>
       <w:ind w:left="-288"/>
@@ -1066,7 +1137,7 @@
 </file>
 
 <file path=word/numbering.xml><?xml version="1.0" encoding="utf-8"?>
-<w:numbering xmlns:wpc="http://schemas.microsoft.com/office/word/2010/wordprocessingCanvas" xmlns:cx="http://schemas.microsoft.com/office/drawing/2014/chartex" xmlns:cx1="http://schemas.microsoft.com/office/drawing/2015/9/8/chartex" xmlns:cx2="http://schemas.microsoft.com/office/drawing/2015/10/21/chartex" xmlns:cx3="http://schemas.microsoft.com/office/drawing/2016/5/9/chartex" xmlns:cx4="http://schemas.microsoft.com/office/drawing/2016/5/10/chartex" xmlns:cx5="http://schemas.microsoft.com/office/drawing/2016/5/11/chartex" xmlns:cx6="http://schemas.microsoft.com/office/drawing/2016/5/12/chartex" xmlns:cx7="http://schemas.microsoft.com/office/drawing/2016/5/13/chartex" xmlns:cx8="http://schemas.microsoft.com/office/drawing/2016/5/14/chartex" xmlns:mc="http://schemas.openxmlformats.org/markup-compatibility/2006" xmlns:aink="http://schemas.microsoft.com/office/drawing/2016/ink" xmlns:am3d="http://schemas.microsoft.com/office/drawing/2017/model3d" xmlns:o="urn:schemas-microsoft-com:office:office" xmlns:r="http://schemas.openxmlformats.org/officeDocument/2006/relationships" xmlns:m="http://schemas.openxmlformats.org/officeDocument/2006/math" xmlns:v="urn:schemas-microsoft-com:vml" xmlns:wp14="http://schemas.microsoft.com/office/word/2010/wordprocessingDrawing" xmlns:wp="http://schemas.openxmlformats.org/drawingml/2006/wordprocessingDrawing" xmlns:w10="urn:schemas-microsoft-com:office:word" xmlns:w="http://schemas.openxmlformats.org/wordprocessingml/2006/main" xmlns:w14="http://schemas.microsoft.com/office/word/2010/wordml" xmlns:w15="http://schemas.microsoft.com/office/word/2012/wordml" xmlns:w16cex="http://schemas.microsoft.com/office/word/2018/wordml/cex" xmlns:w16cid="http://schemas.microsoft.com/office/word/2016/wordml/cid" xmlns:w16="http://schemas.microsoft.com/office/word/2018/wordml" xmlns:w16se="http://schemas.microsoft.com/office/word/2015/wordml/symex" xmlns:wpg="http://schemas.microsoft.com/office/word/2010/wordprocessingGroup" xmlns:wpi="http://schemas.microsoft.com/office/word/2010/wordprocessingInk" xmlns:wne="http://schemas.microsoft.com/office/word/2006/wordml" xmlns:wps="http://schemas.microsoft.com/office/word/2010/wordprocessingShape" mc:Ignorable="w14 w15 w16se w16cid w16 w16cex wp14">
+<w:numbering xmlns:wpc="http://schemas.microsoft.com/office/word/2010/wordprocessingCanvas" xmlns:cx="http://schemas.microsoft.com/office/drawing/2014/chartex" xmlns:cx1="http://schemas.microsoft.com/office/drawing/2015/9/8/chartex" xmlns:cx2="http://schemas.microsoft.com/office/drawing/2015/10/21/chartex" xmlns:cx3="http://schemas.microsoft.com/office/drawing/2016/5/9/chartex" xmlns:cx4="http://schemas.microsoft.com/office/drawing/2016/5/10/chartex" xmlns:cx5="http://schemas.microsoft.com/office/drawing/2016/5/11/chartex" xmlns:cx6="http://schemas.microsoft.com/office/drawing/2016/5/12/chartex" xmlns:cx7="http://schemas.microsoft.com/office/drawing/2016/5/13/chartex" xmlns:cx8="http://schemas.microsoft.com/office/drawing/2016/5/14/chartex" xmlns:mc="http://schemas.openxmlformats.org/markup-compatibility/2006" xmlns:aink="http://schemas.microsoft.com/office/drawing/2016/ink" xmlns:am3d="http://schemas.microsoft.com/office/drawing/2017/model3d" xmlns:o="urn:schemas-microsoft-com:office:office" xmlns:oel="http://schemas.microsoft.com/office/2019/extlst" xmlns:r="http://schemas.openxmlformats.org/officeDocument/2006/relationships" xmlns:m="http://schemas.openxmlformats.org/officeDocument/2006/math" xmlns:v="urn:schemas-microsoft-com:vml" xmlns:wp14="http://schemas.microsoft.com/office/word/2010/wordprocessingDrawing" xmlns:wp="http://schemas.openxmlformats.org/drawingml/2006/wordprocessingDrawing" xmlns:w10="urn:schemas-microsoft-com:office:word" xmlns:w="http://schemas.openxmlformats.org/wordprocessingml/2006/main" xmlns:w14="http://schemas.microsoft.com/office/word/2010/wordml" xmlns:w15="http://schemas.microsoft.com/office/word/2012/wordml" xmlns:w16cex="http://schemas.microsoft.com/office/word/2018/wordml/cex" xmlns:w16cid="http://schemas.microsoft.com/office/word/2016/wordml/cid" xmlns:w16="http://schemas.microsoft.com/office/word/2018/wordml" xmlns:w16du="http://schemas.microsoft.com/office/word/2023/wordml/word16du" xmlns:w16sdtdh="http://schemas.microsoft.com/office/word/2020/wordml/sdtdatahash" xmlns:w16sdtfl="http://schemas.microsoft.com/office/word/2024/wordml/sdtformatlock" xmlns:w16se="http://schemas.microsoft.com/office/word/2015/wordml/symex" xmlns:wpg="http://schemas.microsoft.com/office/word/2010/wordprocessingGroup" xmlns:wpi="http://schemas.microsoft.com/office/word/2010/wordprocessingInk" xmlns:wne="http://schemas.microsoft.com/office/word/2006/wordml" xmlns:wps="http://schemas.microsoft.com/office/word/2010/wordprocessingShape" mc:Ignorable="w14 w15 w16se w16cid w16 w16cex w16sdtdh w16sdtfl w16du wp14">
   <w:abstractNum w:abstractNumId="0" w15:restartNumberingAfterBreak="0">
     <w:nsid w:val="04B70C52"/>
     <w:multiLevelType w:val="hybridMultilevel"/>
@@ -2438,10 +2509,10 @@
       </w:rPr>
     </w:lvl>
   </w:abstractNum>
-  <w:num w:numId="1">
+  <w:num w:numId="1" w16cid:durableId="1382827241">
     <w:abstractNumId w:val="9"/>
   </w:num>
-  <w:num w:numId="2">
+  <w:num w:numId="2" w16cid:durableId="1718428615">
     <w:abstractNumId w:val="5"/>
     <w:lvlOverride w:ilvl="0">
       <w:lvl w:ilvl="0">
@@ -2585,10 +2656,10 @@
       </w:lvl>
     </w:lvlOverride>
   </w:num>
-  <w:num w:numId="3">
+  <w:num w:numId="3" w16cid:durableId="975718699">
     <w:abstractNumId w:val="3"/>
   </w:num>
-  <w:num w:numId="4">
+  <w:num w:numId="4" w16cid:durableId="450167346">
     <w:abstractNumId w:val="5"/>
     <w:lvlOverride w:ilvl="0">
       <w:startOverride w:val="1"/>
@@ -2741,16 +2812,16 @@
       </w:lvl>
     </w:lvlOverride>
   </w:num>
-  <w:num w:numId="5">
+  <w:num w:numId="5" w16cid:durableId="941299136">
     <w:abstractNumId w:val="5"/>
   </w:num>
-  <w:num w:numId="6">
+  <w:num w:numId="6" w16cid:durableId="25571389">
     <w:abstractNumId w:val="0"/>
   </w:num>
-  <w:num w:numId="7">
+  <w:num w:numId="7" w16cid:durableId="9138443">
     <w:abstractNumId w:val="1"/>
   </w:num>
-  <w:num w:numId="8">
+  <w:num w:numId="8" w16cid:durableId="313489470">
     <w:abstractNumId w:val="6"/>
     <w:lvlOverride w:ilvl="0">
       <w:lvl w:ilvl="0">
@@ -2770,13 +2841,13 @@
       </w:lvl>
     </w:lvlOverride>
   </w:num>
-  <w:num w:numId="9">
+  <w:num w:numId="9" w16cid:durableId="1874415091">
     <w:abstractNumId w:val="5"/>
   </w:num>
-  <w:num w:numId="10">
+  <w:num w:numId="10" w16cid:durableId="781728871">
     <w:abstractNumId w:val="8"/>
   </w:num>
-  <w:num w:numId="11">
+  <w:num w:numId="11" w16cid:durableId="80957134">
     <w:abstractNumId w:val="4"/>
     <w:lvlOverride w:ilvl="0">
       <w:lvl w:ilvl="0">
@@ -2913,10 +2984,10 @@
       </w:lvl>
     </w:lvlOverride>
   </w:num>
-  <w:num w:numId="12">
+  <w:num w:numId="12" w16cid:durableId="1636254655">
     <w:abstractNumId w:val="4"/>
   </w:num>
-  <w:num w:numId="13">
+  <w:num w:numId="13" w16cid:durableId="251663014">
     <w:abstractNumId w:val="9"/>
     <w:lvlOverride w:ilvl="0">
       <w:lvl w:ilvl="0">
@@ -2936,7 +3007,7 @@
       </w:lvl>
     </w:lvlOverride>
   </w:num>
-  <w:num w:numId="14">
+  <w:num w:numId="14" w16cid:durableId="1408500519">
     <w:abstractNumId w:val="2"/>
     <w:lvlOverride w:ilvl="0">
       <w:lvl w:ilvl="0">
@@ -3075,7 +3146,7 @@
       </w:lvl>
     </w:lvlOverride>
   </w:num>
-  <w:num w:numId="15">
+  <w:num w:numId="15" w16cid:durableId="1774130780">
     <w:abstractNumId w:val="2"/>
     <w:lvlOverride w:ilvl="0">
       <w:startOverride w:val="1"/>
@@ -3223,13 +3294,13 @@
       </w:lvl>
     </w:lvlOverride>
   </w:num>
-  <w:num w:numId="16">
+  <w:num w:numId="16" w16cid:durableId="1623339094">
     <w:abstractNumId w:val="2"/>
   </w:num>
-  <w:num w:numId="17">
+  <w:num w:numId="17" w16cid:durableId="476072093">
     <w:abstractNumId w:val="10"/>
   </w:num>
-  <w:num w:numId="18">
+  <w:num w:numId="18" w16cid:durableId="1250385744">
     <w:abstractNumId w:val="10"/>
     <w:lvlOverride w:ilvl="0">
       <w:startOverride w:val="1"/>
@@ -3259,7 +3330,7 @@
       <w:startOverride w:val="1"/>
     </w:lvlOverride>
   </w:num>
-  <w:num w:numId="19">
+  <w:num w:numId="19" w16cid:durableId="1004548432">
     <w:abstractNumId w:val="7"/>
   </w:num>
   <w:numIdMacAtCleanup w:val="4"/>
@@ -3267,7 +3338,7 @@
 </file>
 
 <file path=word/styles.xml><?xml version="1.0" encoding="utf-8"?>
-<w:styles xmlns:mc="http://schemas.openxmlformats.org/markup-compatibility/2006" xmlns:r="http://schemas.openxmlformats.org/officeDocument/2006/relationships" xmlns:w="http://schemas.openxmlformats.org/wordprocessingml/2006/main" xmlns:w14="http://schemas.microsoft.com/office/word/2010/wordml" xmlns:w15="http://schemas.microsoft.com/office/word/2012/wordml" xmlns:w16cex="http://schemas.microsoft.com/office/word/2018/wordml/cex" xmlns:w16cid="http://schemas.microsoft.com/office/word/2016/wordml/cid" xmlns:w16="http://schemas.microsoft.com/office/word/2018/wordml" xmlns:w16se="http://schemas.microsoft.com/office/word/2015/wordml/symex" mc:Ignorable="w14 w15 w16se w16cid w16 w16cex">
+<w:styles xmlns:mc="http://schemas.openxmlformats.org/markup-compatibility/2006" xmlns:r="http://schemas.openxmlformats.org/officeDocument/2006/relationships" xmlns:w="http://schemas.openxmlformats.org/wordprocessingml/2006/main" xmlns:w14="http://schemas.microsoft.com/office/word/2010/wordml" xmlns:w15="http://schemas.microsoft.com/office/word/2012/wordml" xmlns:w16cex="http://schemas.microsoft.com/office/word/2018/wordml/cex" xmlns:w16cid="http://schemas.microsoft.com/office/word/2016/wordml/cid" xmlns:w16="http://schemas.microsoft.com/office/word/2018/wordml" xmlns:w16du="http://schemas.microsoft.com/office/word/2023/wordml/word16du" xmlns:w16sdtdh="http://schemas.microsoft.com/office/word/2020/wordml/sdtdatahash" xmlns:w16sdtfl="http://schemas.microsoft.com/office/word/2024/wordml/sdtformatlock" xmlns:w16se="http://schemas.microsoft.com/office/word/2015/wordml/symex" mc:Ignorable="w14 w15 w16se w16cid w16 w16cex w16sdtdh w16sdtfl w16du">
   <w:docDefaults>
     <w:rPrDefault>
       <w:rPr>
@@ -3870,7 +3941,6 @@
   <w:style w:type="character" w:default="1" w:styleId="DefaultParagraphFont">
     <w:name w:val="Default Paragraph Font"/>
     <w:uiPriority w:val="1"/>
-    <w:semiHidden/>
     <w:unhideWhenUsed/>
   </w:style>
   <w:style w:type="table" w:default="1" w:styleId="TableNormal">
@@ -5613,7 +5683,7 @@
 </file>
 
 <file path=word/glossary/document.xml><?xml version="1.0" encoding="utf-8"?>
-<w:glossaryDocument xmlns:wpc="http://schemas.microsoft.com/office/word/2010/wordprocessingCanvas" xmlns:cx="http://schemas.microsoft.com/office/drawing/2014/chartex" xmlns:cx1="http://schemas.microsoft.com/office/drawing/2015/9/8/chartex" xmlns:cx2="http://schemas.microsoft.com/office/drawing/2015/10/21/chartex" xmlns:cx3="http://schemas.microsoft.com/office/drawing/2016/5/9/chartex" xmlns:cx4="http://schemas.microsoft.com/office/drawing/2016/5/10/chartex" xmlns:cx5="http://schemas.microsoft.com/office/drawing/2016/5/11/chartex" xmlns:cx6="http://schemas.microsoft.com/office/drawing/2016/5/12/chartex" xmlns:cx7="http://schemas.microsoft.com/office/drawing/2016/5/13/chartex" xmlns:cx8="http://schemas.microsoft.com/office/drawing/2016/5/14/chartex" xmlns:mc="http://schemas.openxmlformats.org/markup-compatibility/2006" xmlns:aink="http://schemas.microsoft.com/office/drawing/2016/ink" xmlns:am3d="http://schemas.microsoft.com/office/drawing/2017/model3d" xmlns:o="urn:schemas-microsoft-com:office:office" xmlns:r="http://schemas.openxmlformats.org/officeDocument/2006/relationships" xmlns:m="http://schemas.openxmlformats.org/officeDocument/2006/math" xmlns:v="urn:schemas-microsoft-com:vml" xmlns:wp14="http://schemas.microsoft.com/office/word/2010/wordprocessingDrawing" xmlns:wp="http://schemas.openxmlformats.org/drawingml/2006/wordprocessingDrawing" xmlns:w10="urn:schemas-microsoft-com:office:word" xmlns:w="http://schemas.openxmlformats.org/wordprocessingml/2006/main" xmlns:w14="http://schemas.microsoft.com/office/word/2010/wordml" xmlns:w15="http://schemas.microsoft.com/office/word/2012/wordml" xmlns:w16cex="http://schemas.microsoft.com/office/word/2018/wordml/cex" xmlns:w16cid="http://schemas.microsoft.com/office/word/2016/wordml/cid" xmlns:w16="http://schemas.microsoft.com/office/word/2018/wordml" xmlns:w16se="http://schemas.microsoft.com/office/word/2015/wordml/symex" xmlns:wpg="http://schemas.microsoft.com/office/word/2010/wordprocessingGroup" xmlns:wpi="http://schemas.microsoft.com/office/word/2010/wordprocessingInk" xmlns:wne="http://schemas.microsoft.com/office/word/2006/wordml" xmlns:wps="http://schemas.microsoft.com/office/word/2010/wordprocessingShape" mc:Ignorable="w14 w15 w16se w16cid w16 w16cex wp14">
+<w:glossaryDocument xmlns:wpc="http://schemas.microsoft.com/office/word/2010/wordprocessingCanvas" xmlns:cx="http://schemas.microsoft.com/office/drawing/2014/chartex" xmlns:cx1="http://schemas.microsoft.com/office/drawing/2015/9/8/chartex" xmlns:cx2="http://schemas.microsoft.com/office/drawing/2015/10/21/chartex" xmlns:cx3="http://schemas.microsoft.com/office/drawing/2016/5/9/chartex" xmlns:cx4="http://schemas.microsoft.com/office/drawing/2016/5/10/chartex" xmlns:cx5="http://schemas.microsoft.com/office/drawing/2016/5/11/chartex" xmlns:cx6="http://schemas.microsoft.com/office/drawing/2016/5/12/chartex" xmlns:cx7="http://schemas.microsoft.com/office/drawing/2016/5/13/chartex" xmlns:cx8="http://schemas.microsoft.com/office/drawing/2016/5/14/chartex" xmlns:mc="http://schemas.openxmlformats.org/markup-compatibility/2006" xmlns:aink="http://schemas.microsoft.com/office/drawing/2016/ink" xmlns:am3d="http://schemas.microsoft.com/office/drawing/2017/model3d" xmlns:o="urn:schemas-microsoft-com:office:office" xmlns:oel="http://schemas.microsoft.com/office/2019/extlst" xmlns:r="http://schemas.openxmlformats.org/officeDocument/2006/relationships" xmlns:m="http://schemas.openxmlformats.org/officeDocument/2006/math" xmlns:v="urn:schemas-microsoft-com:vml" xmlns:wp14="http://schemas.microsoft.com/office/word/2010/wordprocessingDrawing" xmlns:wp="http://schemas.openxmlformats.org/drawingml/2006/wordprocessingDrawing" xmlns:w10="urn:schemas-microsoft-com:office:word" xmlns:w="http://schemas.openxmlformats.org/wordprocessingml/2006/main" xmlns:w14="http://schemas.microsoft.com/office/word/2010/wordml" xmlns:w15="http://schemas.microsoft.com/office/word/2012/wordml" xmlns:w16cex="http://schemas.microsoft.com/office/word/2018/wordml/cex" xmlns:w16cid="http://schemas.microsoft.com/office/word/2016/wordml/cid" xmlns:w16="http://schemas.microsoft.com/office/word/2018/wordml" xmlns:w16du="http://schemas.microsoft.com/office/word/2023/wordml/word16du" xmlns:w16sdtdh="http://schemas.microsoft.com/office/word/2020/wordml/sdtdatahash" xmlns:w16sdtfl="http://schemas.microsoft.com/office/word/2024/wordml/sdtformatlock" xmlns:w16se="http://schemas.microsoft.com/office/word/2015/wordml/symex" xmlns:wpg="http://schemas.microsoft.com/office/word/2010/wordprocessingGroup" xmlns:wpi="http://schemas.microsoft.com/office/word/2010/wordprocessingInk" xmlns:wne="http://schemas.microsoft.com/office/word/2006/wordml" xmlns:wps="http://schemas.microsoft.com/office/word/2010/wordprocessingShape" mc:Ignorable="w14 w15 w16se w16cid w16 w16cex w16sdtdh w16sdtfl w16du wp14">
   <w:docParts>
     <w:docPart>
       <w:docPartPr>
@@ -5649,7 +5719,7 @@
 </file>
 
 <file path=word/glossary/fontTable.xml><?xml version="1.0" encoding="utf-8"?>
-<w:fonts xmlns:mc="http://schemas.openxmlformats.org/markup-compatibility/2006" xmlns:r="http://schemas.openxmlformats.org/officeDocument/2006/relationships" xmlns:w="http://schemas.openxmlformats.org/wordprocessingml/2006/main" xmlns:w14="http://schemas.microsoft.com/office/word/2010/wordml" xmlns:w15="http://schemas.microsoft.com/office/word/2012/wordml" xmlns:w16cex="http://schemas.microsoft.com/office/word/2018/wordml/cex" xmlns:w16cid="http://schemas.microsoft.com/office/word/2016/wordml/cid" xmlns:w16="http://schemas.microsoft.com/office/word/2018/wordml" xmlns:w16se="http://schemas.microsoft.com/office/word/2015/wordml/symex" mc:Ignorable="w14 w15 w16se w16cid w16 w16cex">
+<w:fonts xmlns:mc="http://schemas.openxmlformats.org/markup-compatibility/2006" xmlns:r="http://schemas.openxmlformats.org/officeDocument/2006/relationships" xmlns:w="http://schemas.openxmlformats.org/wordprocessingml/2006/main" xmlns:w14="http://schemas.microsoft.com/office/word/2010/wordml" xmlns:w15="http://schemas.microsoft.com/office/word/2012/wordml" xmlns:w16cex="http://schemas.microsoft.com/office/word/2018/wordml/cex" xmlns:w16cid="http://schemas.microsoft.com/office/word/2016/wordml/cid" xmlns:w16="http://schemas.microsoft.com/office/word/2018/wordml" xmlns:w16du="http://schemas.microsoft.com/office/word/2023/wordml/word16du" xmlns:w16sdtdh="http://schemas.microsoft.com/office/word/2020/wordml/sdtdatahash" xmlns:w16sdtfl="http://schemas.microsoft.com/office/word/2024/wordml/sdtformatlock" xmlns:w16se="http://schemas.microsoft.com/office/word/2015/wordml/symex" mc:Ignorable="w14 w15 w16se w16cid w16 w16cex w16sdtdh w16sdtfl w16du">
   <w:font w:name="Arial">
     <w:panose1 w:val="020B0604020202020204"/>
     <w:charset w:val="00"/>
@@ -5690,7 +5760,7 @@
     <w:charset w:val="00"/>
     <w:family w:val="swiss"/>
     <w:pitch w:val="variable"/>
-    <w:sig w:usb0="E4002EFF" w:usb1="C000247B" w:usb2="00000009" w:usb3="00000000" w:csb0="000001FF" w:csb1="00000000"/>
+    <w:sig w:usb0="E4002EFF" w:usb1="C200247B" w:usb2="00000009" w:usb3="00000000" w:csb0="000001FF" w:csb1="00000000"/>
   </w:font>
   <w:font w:name="Webdings">
     <w:panose1 w:val="05030102010509060703"/>
@@ -5712,7 +5782,14 @@
     <w:charset w:val="86"/>
     <w:family w:val="auto"/>
     <w:pitch w:val="variable"/>
-    <w:sig w:usb0="00000003" w:usb1="288F0000" w:usb2="00000016" w:usb3="00000000" w:csb0="00040001" w:csb1="00000000"/>
+    <w:sig w:usb0="00000203" w:usb1="288F0000" w:usb2="00000016" w:usb3="00000000" w:csb0="00040001" w:csb1="00000000"/>
+  </w:font>
+  <w:font w:name="Angsana New">
+    <w:panose1 w:val="02020603050405020304"/>
+    <w:charset w:val="DE"/>
+    <w:family w:val="roman"/>
+    <w:pitch w:val="variable"/>
+    <w:sig w:usb0="81000003" w:usb1="00000000" w:usb2="00000000" w:usb3="00000000" w:csb0="00010001" w:csb1="00000000"/>
   </w:font>
   <w:font w:name="Cambria">
     <w:panose1 w:val="02040503050406030204"/>
@@ -5720,6 +5797,19 @@
     <w:family w:val="roman"/>
     <w:pitch w:val="variable"/>
     <w:sig w:usb0="E00006FF" w:usb1="420024FF" w:usb2="02000000" w:usb3="00000000" w:csb0="0000019F" w:csb1="00000000"/>
+  </w:font>
+  <w:font w:name="Cordia New">
+    <w:panose1 w:val="020B0304020202020204"/>
+    <w:charset w:val="DE"/>
+    <w:family w:val="swiss"/>
+    <w:pitch w:val="variable"/>
+    <w:sig w:usb0="81000003" w:usb1="00000000" w:usb2="00000000" w:usb3="00000000" w:csb0="00010001" w:csb1="00000000"/>
+  </w:font>
+  <w:font w:name="Aptos">
+    <w:charset w:val="00"/>
+    <w:family w:val="swiss"/>
+    <w:pitch w:val="variable"/>
+    <w:sig w:usb0="20000287" w:usb1="00000003" w:usb2="00000000" w:usb3="00000000" w:csb0="0000019F" w:csb1="00000000"/>
   </w:font>
   <w:font w:name="DengXian">
     <w:altName w:val="等线"/>
@@ -5736,18 +5826,17 @@
     <w:pitch w:val="variable"/>
     <w:sig w:usb0="A00002BF" w:usb1="38CF7CFA" w:usb2="00000016" w:usb3="00000000" w:csb0="0004000F" w:csb1="00000000"/>
   </w:font>
-  <w:font w:name="Calibri Light">
-    <w:panose1 w:val="020F0302020204030204"/>
+  <w:font w:name="Aptos Display">
     <w:charset w:val="00"/>
     <w:family w:val="swiss"/>
     <w:pitch w:val="variable"/>
-    <w:sig w:usb0="E4002EFF" w:usb1="C000247B" w:usb2="00000009" w:usb3="00000000" w:csb0="000001FF" w:csb1="00000000"/>
+    <w:sig w:usb0="20000287" w:usb1="00000003" w:usb2="00000000" w:usb3="00000000" w:csb0="0000019F" w:csb1="00000000"/>
   </w:font>
 </w:fonts>
 </file>
 
 <file path=word/glossary/settings.xml><?xml version="1.0" encoding="utf-8"?>
-<w:settings xmlns:mc="http://schemas.openxmlformats.org/markup-compatibility/2006" xmlns:o="urn:schemas-microsoft-com:office:office" xmlns:r="http://schemas.openxmlformats.org/officeDocument/2006/relationships" xmlns:m="http://schemas.openxmlformats.org/officeDocument/2006/math" xmlns:v="urn:schemas-microsoft-com:vml" xmlns:w10="urn:schemas-microsoft-com:office:word" xmlns:w="http://schemas.openxmlformats.org/wordprocessingml/2006/main" xmlns:w14="http://schemas.microsoft.com/office/word/2010/wordml" xmlns:w15="http://schemas.microsoft.com/office/word/2012/wordml" xmlns:w16cex="http://schemas.microsoft.com/office/word/2018/wordml/cex" xmlns:w16cid="http://schemas.microsoft.com/office/word/2016/wordml/cid" xmlns:w16="http://schemas.microsoft.com/office/word/2018/wordml" xmlns:w16se="http://schemas.microsoft.com/office/word/2015/wordml/symex" xmlns:sl="http://schemas.openxmlformats.org/schemaLibrary/2006/main" mc:Ignorable="w14 w15 w16se w16cid w16 w16cex">
+<w:settings xmlns:mc="http://schemas.openxmlformats.org/markup-compatibility/2006" xmlns:o="urn:schemas-microsoft-com:office:office" xmlns:r="http://schemas.openxmlformats.org/officeDocument/2006/relationships" xmlns:m="http://schemas.openxmlformats.org/officeDocument/2006/math" xmlns:v="urn:schemas-microsoft-com:vml" xmlns:w10="urn:schemas-microsoft-com:office:word" xmlns:w="http://schemas.openxmlformats.org/wordprocessingml/2006/main" xmlns:w14="http://schemas.microsoft.com/office/word/2010/wordml" xmlns:w15="http://schemas.microsoft.com/office/word/2012/wordml" xmlns:w16cex="http://schemas.microsoft.com/office/word/2018/wordml/cex" xmlns:w16cid="http://schemas.microsoft.com/office/word/2016/wordml/cid" xmlns:w16="http://schemas.microsoft.com/office/word/2018/wordml" xmlns:w16du="http://schemas.microsoft.com/office/word/2023/wordml/word16du" xmlns:w16sdtdh="http://schemas.microsoft.com/office/word/2020/wordml/sdtdatahash" xmlns:w16sdtfl="http://schemas.microsoft.com/office/word/2024/wordml/sdtformatlock" xmlns:w16se="http://schemas.microsoft.com/office/word/2015/wordml/symex" xmlns:sl="http://schemas.openxmlformats.org/schemaLibrary/2006/main" mc:Ignorable="w14 w15 w16se w16cid w16 w16cex w16sdtdh w16sdtfl w16du">
   <w:view w:val="normal"/>
   <w:defaultTabStop w:val="720"/>
   <w:characterSpacingControl w:val="doNotCompress"/>
@@ -5768,9 +5857,11 @@
     <w:rsid w:val="00783651"/>
     <w:rsid w:val="0078609D"/>
     <w:rsid w:val="0096372E"/>
+    <w:rsid w:val="009C1E2F"/>
     <w:rsid w:val="00A60142"/>
     <w:rsid w:val="00D47610"/>
     <w:rsid w:val="00ED4528"/>
+    <w:rsid w:val="00EE4645"/>
   </w:rsids>
   <m:mathPr>
     <m:mathFont m:val="Cambria Math"/>
@@ -5785,7 +5876,7 @@
     <m:intLim m:val="subSup"/>
     <m:naryLim m:val="undOvr"/>
   </m:mathPr>
-  <w:themeFontLang w:val="en-US" w:eastAsia="zh-CN"/>
+  <w:themeFontLang w:val="en-US" w:eastAsia="zh-CN" w:bidi="th-TH"/>
   <w:clrSchemeMapping w:bg1="light1" w:t1="dark1" w:bg2="light2" w:t2="dark2" w:accent1="accent1" w:accent2="accent2" w:accent3="accent3" w:accent4="accent4" w:accent5="accent5" w:accent6="accent6" w:hyperlink="hyperlink" w:followedHyperlink="followedHyperlink"/>
   <w:decimalSymbol w:val="."/>
   <w:listSeparator w:val=","/>
@@ -5794,7 +5885,7 @@
 </file>
 
 <file path=word/glossary/styles.xml><?xml version="1.0" encoding="utf-8"?>
-<w:styles xmlns:mc="http://schemas.openxmlformats.org/markup-compatibility/2006" xmlns:r="http://schemas.openxmlformats.org/officeDocument/2006/relationships" xmlns:w="http://schemas.openxmlformats.org/wordprocessingml/2006/main" xmlns:w14="http://schemas.microsoft.com/office/word/2010/wordml" xmlns:w15="http://schemas.microsoft.com/office/word/2012/wordml" xmlns:w16cex="http://schemas.microsoft.com/office/word/2018/wordml/cex" xmlns:w16cid="http://schemas.microsoft.com/office/word/2016/wordml/cid" xmlns:w16="http://schemas.microsoft.com/office/word/2018/wordml" xmlns:w16se="http://schemas.microsoft.com/office/word/2015/wordml/symex" mc:Ignorable="w14 w15 w16se w16cid w16 w16cex">
+<w:styles xmlns:mc="http://schemas.openxmlformats.org/markup-compatibility/2006" xmlns:r="http://schemas.openxmlformats.org/officeDocument/2006/relationships" xmlns:w="http://schemas.openxmlformats.org/wordprocessingml/2006/main" xmlns:w14="http://schemas.microsoft.com/office/word/2010/wordml" xmlns:w15="http://schemas.microsoft.com/office/word/2012/wordml" xmlns:w16cex="http://schemas.microsoft.com/office/word/2018/wordml/cex" xmlns:w16cid="http://schemas.microsoft.com/office/word/2016/wordml/cid" xmlns:w16="http://schemas.microsoft.com/office/word/2018/wordml" xmlns:w16du="http://schemas.microsoft.com/office/word/2023/wordml/word16du" xmlns:w16sdtdh="http://schemas.microsoft.com/office/word/2020/wordml/sdtdatahash" xmlns:w16sdtfl="http://schemas.microsoft.com/office/word/2024/wordml/sdtformatlock" xmlns:w16se="http://schemas.microsoft.com/office/word/2015/wordml/symex" mc:Ignorable="w14 w15 w16se w16cid w16 w16cex w16sdtdh w16sdtfl w16du">
   <w:docDefaults>
     <w:rPrDefault>
       <w:rPr>
@@ -6235,7 +6326,7 @@
 </file>
 
 <file path=word/glossary/webSettings.xml><?xml version="1.0" encoding="utf-8"?>
-<w:webSettings xmlns:mc="http://schemas.openxmlformats.org/markup-compatibility/2006" xmlns:r="http://schemas.openxmlformats.org/officeDocument/2006/relationships" xmlns:w="http://schemas.openxmlformats.org/wordprocessingml/2006/main" xmlns:w14="http://schemas.microsoft.com/office/word/2010/wordml" xmlns:w15="http://schemas.microsoft.com/office/word/2012/wordml" xmlns:w16cex="http://schemas.microsoft.com/office/word/2018/wordml/cex" xmlns:w16cid="http://schemas.microsoft.com/office/word/2016/wordml/cid" xmlns:w16="http://schemas.microsoft.com/office/word/2018/wordml" xmlns:w16se="http://schemas.microsoft.com/office/word/2015/wordml/symex" mc:Ignorable="w14 w15 w16se w16cid w16 w16cex">
+<w:webSettings xmlns:mc="http://schemas.openxmlformats.org/markup-compatibility/2006" xmlns:r="http://schemas.openxmlformats.org/officeDocument/2006/relationships" xmlns:w="http://schemas.openxmlformats.org/wordprocessingml/2006/main" xmlns:w14="http://schemas.microsoft.com/office/word/2010/wordml" xmlns:w15="http://schemas.microsoft.com/office/word/2012/wordml" xmlns:w16cex="http://schemas.microsoft.com/office/word/2018/wordml/cex" xmlns:w16cid="http://schemas.microsoft.com/office/word/2016/wordml/cid" xmlns:w16="http://schemas.microsoft.com/office/word/2018/wordml" xmlns:w16du="http://schemas.microsoft.com/office/word/2023/wordml/word16du" xmlns:w16sdtdh="http://schemas.microsoft.com/office/word/2020/wordml/sdtdatahash" xmlns:w16sdtfl="http://schemas.microsoft.com/office/word/2024/wordml/sdtformatlock" xmlns:w16se="http://schemas.microsoft.com/office/word/2015/wordml/symex" mc:Ignorable="w14 w15 w16se w16cid w16 w16cex w16sdtdh w16sdtfl w16du">
   <w:optimizeForBrowser/>
   <w:allowPNG/>
 </w:webSettings>

</xml_diff>